<commit_message>
Synchronize updated Red Herring Prospectus PII sample log, evaluation_report.docx, and redacted_output.docx
</commit_message>
<xml_diff>
--- a/redacted_output.docx
+++ b/redacted_output.docx
@@ -103,7 +103,7 @@
                 <w:color w:val="334155"/>
                 <w:sz w:val="19"/>
               </w:rPr>
-              <w:t xml:space="preserve"> 18 Items</w:t>
+              <w:t xml:space="preserve"> 29 Items</w:t>
             </w:r>
           </w:p>
         </w:tc>
@@ -168,7 +168,7 @@
           <w:color w:val="1E293B"/>
           <w:sz w:val="22"/>
         </w:rPr>
-        <w:t>Ticket 10293</w:t>
+        <w:t>Ticket Log #10293</w:t>
       </w:r>
     </w:p>
     <w:p>
@@ -181,7 +181,7 @@
           <w:color w:val="1E293B"/>
           <w:sz w:val="22"/>
         </w:rPr>
-        <w:t>Customer: John Doe</w:t>
+        <w:t>Customer Name: John Doe</w:t>
       </w:r>
     </w:p>
     <w:p>
@@ -194,7 +194,7 @@
           <w:color w:val="1E293B"/>
           <w:sz w:val="22"/>
         </w:rPr>
-        <w:t>Email: john.doe@example.com</w:t>
+        <w:t>Email Address: john.doe@example.com</w:t>
       </w:r>
     </w:p>
     <w:p>
@@ -207,7 +207,7 @@
           <w:color w:val="1E293B"/>
           <w:sz w:val="22"/>
         </w:rPr>
-        <w:t>Phone: +91 1234567890</w:t>
+        <w:t>Phone Number: +91 1234567890</w:t>
       </w:r>
     </w:p>
     <w:p>
@@ -220,7 +220,7 @@
           <w:color w:val="1E293B"/>
           <w:sz w:val="22"/>
         </w:rPr>
-        <w:t>Company: Acme Private Limited</w:t>
+        <w:t>Company Name: Acme Private Limited</w:t>
       </w:r>
     </w:p>
     <w:p>
@@ -233,7 +233,7 @@
           <w:color w:val="1E293B"/>
           <w:sz w:val="22"/>
         </w:rPr>
-        <w:t>Address: 221B Baker Street, London NW1 6XE</w:t>
+        <w:t>Physical Address: 221B Baker Street, London NW1 6XE</w:t>
       </w:r>
     </w:p>
     <w:p>
@@ -246,7 +246,7 @@
           <w:color w:val="1E293B"/>
           <w:sz w:val="22"/>
         </w:rPr>
-        <w:t>DOB: 01/01/1990</w:t>
+        <w:t>Date of Birth: 01/01/1990</w:t>
       </w:r>
     </w:p>
     <w:p>
@@ -259,7 +259,7 @@
           <w:color w:val="1E293B"/>
           <w:sz w:val="22"/>
         </w:rPr>
-        <w:t>SSN: 321-54-9876</w:t>
+        <w:t>Social Security Number (SSN): 321-54-9876</w:t>
       </w:r>
     </w:p>
     <w:p>
@@ -272,7 +272,7 @@
           <w:color w:val="1E293B"/>
           <w:sz w:val="22"/>
         </w:rPr>
-        <w:t>Card: 4000 0000 0000 1000</w:t>
+        <w:t>Credit Card Number: 4000 0000 0000 1000</w:t>
       </w:r>
     </w:p>
     <w:p>
@@ -285,7 +285,20 @@
           <w:color w:val="1E293B"/>
           <w:sz w:val="22"/>
         </w:rPr>
-        <w:t>IP: 203.0.113.10</w:t>
+        <w:t>IP Address: 203.0.113.10</w:t>
+      </w:r>
+    </w:p>
+    <w:p>
+      <w:pPr>
+        <w:spacing w:after="80" w:line="276" w:lineRule="auto"/>
+      </w:pPr>
+      <w:r>
+        <w:rPr>
+          <w:rFonts w:ascii="Calibri" w:hAnsi="Calibri"/>
+          <w:color w:val="1E293B"/>
+          <w:sz w:val="22"/>
+        </w:rPr>
+        <w:t>Reference Order ID: 77881 (Retained Non-PII)</w:t>
       </w:r>
     </w:p>
     <w:p>
@@ -303,7 +316,7 @@
           <w:color w:val="1E293B"/>
           <w:sz w:val="22"/>
         </w:rPr>
-        <w:t>Ticket 10294</w:t>
+        <w:t>Ticket Log #10294</w:t>
       </w:r>
     </w:p>
     <w:p>
@@ -316,7 +329,7 @@
           <w:color w:val="1E293B"/>
           <w:sz w:val="22"/>
         </w:rPr>
-        <w:t>Customer: Peter Parker</w:t>
+        <w:t>Customer Name: Peter Parker</w:t>
       </w:r>
     </w:p>
     <w:p>
@@ -329,7 +342,7 @@
           <w:color w:val="1E293B"/>
           <w:sz w:val="22"/>
         </w:rPr>
-        <w:t>Email: peter.parker@example.com</w:t>
+        <w:t>Email Address: peter.parker@example.com</w:t>
       </w:r>
     </w:p>
     <w:p>
@@ -342,7 +355,7 @@
           <w:color w:val="1E293B"/>
           <w:sz w:val="22"/>
         </w:rPr>
-        <w:t>Phone: +91 9876501234</w:t>
+        <w:t>Phone Number: +91 9876501234</w:t>
       </w:r>
     </w:p>
     <w:p>
@@ -355,7 +368,7 @@
           <w:color w:val="1E293B"/>
           <w:sz w:val="22"/>
         </w:rPr>
-        <w:t>Company: Northstar Technologies Ltd</w:t>
+        <w:t>Company Name: Northstar Technologies Ltd</w:t>
       </w:r>
     </w:p>
     <w:p>
@@ -368,7 +381,7 @@
           <w:color w:val="1E293B"/>
           <w:sz w:val="22"/>
         </w:rPr>
-        <w:t>Address: 742 Evergreen Terrace, Springfield 49007</w:t>
+        <w:t>Physical Address: 742 Evergreen Terrace, Springfield 49007</w:t>
       </w:r>
     </w:p>
     <w:p>
@@ -394,7 +407,7 @@
           <w:color w:val="1E293B"/>
           <w:sz w:val="22"/>
         </w:rPr>
-        <w:t>SSN: 111-22-3333</w:t>
+        <w:t>Social Security Number (SSN): 111-22-3333</w:t>
       </w:r>
     </w:p>
     <w:p>
@@ -407,7 +420,7 @@
           <w:color w:val="1E293B"/>
           <w:sz w:val="22"/>
         </w:rPr>
-        <w:t>Card: 4000 0000 0000 1001</w:t>
+        <w:t>Credit Card Number: 4000 0000 0000 1001</w:t>
       </w:r>
     </w:p>
     <w:p>
@@ -420,7 +433,20 @@
           <w:color w:val="1E293B"/>
           <w:sz w:val="22"/>
         </w:rPr>
-        <w:t>IP: 198.51.100.25</w:t>
+        <w:t>IP Address: 198.51.100.25</w:t>
+      </w:r>
+    </w:p>
+    <w:p>
+      <w:pPr>
+        <w:spacing w:after="80" w:line="276" w:lineRule="auto"/>
+      </w:pPr>
+      <w:r>
+        <w:rPr>
+          <w:rFonts w:ascii="Calibri" w:hAnsi="Calibri"/>
+          <w:color w:val="1E293B"/>
+          <w:sz w:val="22"/>
+        </w:rPr>
+        <w:t>Reference Ticket Code: T-90812 (Retained Non-PII)</w:t>
       </w:r>
     </w:p>
     <w:p>
@@ -438,7 +464,207 @@
           <w:color w:val="1E293B"/>
           <w:sz w:val="22"/>
         </w:rPr>
-        <w:t>Non-PII fields retained: Order 77881, Ticket 10294, product code A-100.</w:t>
+        <w:t>Red Herring Prospectus Document Excerpt — Bluebird Capital LLP</w:t>
+      </w:r>
+    </w:p>
+    <w:p>
+      <w:pPr>
+        <w:spacing w:after="80" w:line="276" w:lineRule="auto"/>
+      </w:pPr>
+      <w:r>
+        <w:rPr>
+          <w:rFonts w:ascii="Calibri" w:hAnsi="Calibri"/>
+          <w:color w:val="1E293B"/>
+          <w:sz w:val="22"/>
+        </w:rPr>
+        <w:t>Company Name: Bluebird Capital LLP</w:t>
+      </w:r>
+    </w:p>
+    <w:p>
+      <w:pPr>
+        <w:spacing w:after="80" w:line="276" w:lineRule="auto"/>
+      </w:pPr>
+      <w:r>
+        <w:rPr>
+          <w:rFonts w:ascii="Calibri" w:hAnsi="Calibri"/>
+          <w:color w:val="1E293B"/>
+          <w:sz w:val="22"/>
+        </w:rPr>
+        <w:t>Corporate Identity Number: U28129PN1979PLC141032 (Retained Non-PII)</w:t>
+      </w:r>
+    </w:p>
+    <w:p>
+      <w:pPr>
+        <w:spacing w:after="80" w:line="276" w:lineRule="auto"/>
+      </w:pPr>
+      <w:r>
+        <w:rPr>
+          <w:rFonts w:ascii="Calibri" w:hAnsi="Calibri"/>
+          <w:color w:val="1E293B"/>
+          <w:sz w:val="22"/>
+        </w:rPr>
+        <w:t>Contact Person: Sarthak Malvadkar</w:t>
+      </w:r>
+    </w:p>
+    <w:p>
+      <w:pPr>
+        <w:spacing w:after="80" w:line="276" w:lineRule="auto"/>
+      </w:pPr>
+      <w:r>
+        <w:rPr>
+          <w:rFonts w:ascii="Calibri" w:hAnsi="Calibri"/>
+          <w:color w:val="1E293B"/>
+          <w:sz w:val="22"/>
+        </w:rPr>
+        <w:t>Company Secretary and Compliance Officer</w:t>
+      </w:r>
+    </w:p>
+    <w:p>
+      <w:pPr>
+        <w:spacing w:after="80" w:line="276" w:lineRule="auto"/>
+      </w:pPr>
+      <w:r>
+        <w:rPr>
+          <w:rFonts w:ascii="Calibri" w:hAnsi="Calibri"/>
+          <w:color w:val="1E293B"/>
+          <w:sz w:val="22"/>
+        </w:rPr>
+        <w:t>Email Address: ananya.sharma@example.com</w:t>
+      </w:r>
+    </w:p>
+    <w:p>
+      <w:pPr>
+        <w:spacing w:after="80" w:line="276" w:lineRule="auto"/>
+      </w:pPr>
+      <w:r>
+        <w:rPr>
+          <w:rFonts w:ascii="Calibri" w:hAnsi="Calibri"/>
+          <w:color w:val="1E293B"/>
+          <w:sz w:val="22"/>
+        </w:rPr>
+        <w:t>Telephone Number: +1 202 555 0100</w:t>
+      </w:r>
+    </w:p>
+    <w:p>
+      <w:pPr>
+        <w:spacing w:after="80" w:line="276" w:lineRule="auto"/>
+      </w:pPr>
+      <w:r>
+        <w:rPr>
+          <w:rFonts w:ascii="Calibri" w:hAnsi="Calibri"/>
+          <w:color w:val="1E293B"/>
+          <w:sz w:val="22"/>
+        </w:rPr>
+        <w:t>Registered Office Address: 12 Park Avenue, Mumbai 400001</w:t>
+      </w:r>
+    </w:p>
+    <w:p>
+      <w:pPr>
+        <w:spacing w:after="80" w:line="276" w:lineRule="auto"/>
+      </w:pPr>
+      <w:r>
+        <w:rPr>
+          <w:rFonts w:ascii="Calibri" w:hAnsi="Calibri"/>
+          <w:color w:val="1E293B"/>
+          <w:sz w:val="22"/>
+        </w:rPr>
+        <w:t>Corporate Office Address: 221B Baker Street, London NW1 6XE</w:t>
+      </w:r>
+    </w:p>
+    <w:p>
+      <w:pPr>
+        <w:spacing w:after="80" w:line="276" w:lineRule="auto"/>
+      </w:pPr>
+      <w:r>
+        <w:rPr>
+          <w:rFonts w:ascii="Calibri" w:hAnsi="Calibri"/>
+          <w:color w:val="1E293B"/>
+          <w:sz w:val="22"/>
+        </w:rPr>
+        <w:t>Promoters: Kushal Subbayya Hegde, Pushpa Kushal Hegde, Rajesh Kushal Hegde, Rohit Kushal Hegde, Rakhi Girija Shetty</w:t>
+      </w:r>
+    </w:p>
+    <w:p>
+      <w:pPr>
+        <w:spacing w:after="80"/>
+      </w:pPr>
+    </w:p>
+    <w:p>
+      <w:pPr>
+        <w:spacing w:after="80" w:line="276" w:lineRule="auto"/>
+      </w:pPr>
+      <w:r>
+        <w:rPr>
+          <w:rFonts w:ascii="Calibri" w:hAnsi="Calibri"/>
+          <w:color w:val="1E293B"/>
+          <w:sz w:val="22"/>
+        </w:rPr>
+        <w:t>Identity Record Verification</w:t>
+      </w:r>
+    </w:p>
+    <w:p>
+      <w:pPr>
+        <w:spacing w:after="80" w:line="276" w:lineRule="auto"/>
+      </w:pPr>
+      <w:r>
+        <w:rPr>
+          <w:rFonts w:ascii="Calibri" w:hAnsi="Calibri"/>
+          <w:color w:val="1E293B"/>
+          <w:sz w:val="22"/>
+        </w:rPr>
+        <w:t>Name: Ananya Sharma</w:t>
+      </w:r>
+    </w:p>
+    <w:p>
+      <w:pPr>
+        <w:spacing w:after="80" w:line="276" w:lineRule="auto"/>
+      </w:pPr>
+      <w:r>
+        <w:rPr>
+          <w:rFonts w:ascii="Calibri" w:hAnsi="Calibri"/>
+          <w:color w:val="1E293B"/>
+          <w:sz w:val="22"/>
+        </w:rPr>
+        <w:t>Father's Name: Maya Rao</w:t>
+      </w:r>
+    </w:p>
+    <w:p>
+      <w:pPr>
+        <w:spacing w:after="80" w:line="276" w:lineRule="auto"/>
+      </w:pPr>
+      <w:r>
+        <w:rPr>
+          <w:rFonts w:ascii="Calibri" w:hAnsi="Calibri"/>
+          <w:color w:val="1E293B"/>
+          <w:sz w:val="22"/>
+        </w:rPr>
+        <w:t>Date of Birth: 1975-12-10</w:t>
+      </w:r>
+    </w:p>
+    <w:p>
+      <w:pPr>
+        <w:spacing w:after="80" w:line="276" w:lineRule="auto"/>
+      </w:pPr>
+      <w:r>
+        <w:rPr>
+          <w:rFonts w:ascii="Calibri" w:hAnsi="Calibri"/>
+          <w:color w:val="1E293B"/>
+          <w:sz w:val="22"/>
+        </w:rPr>
+        <w:t>Aadhaar ID: +91 1234567890</w:t>
+      </w:r>
+    </w:p>
+    <w:p>
+      <w:pPr>
+        <w:spacing w:after="80" w:line="276" w:lineRule="auto"/>
+      </w:pPr>
+      <w:r>
+        <w:rPr>
+          <w:rFonts w:ascii="Calibri" w:hAnsi="Calibri"/>
+          <w:color w:val="1E293B"/>
+          <w:sz w:val="22"/>
+        </w:rPr>
+        <w:t>Address: 742 Evergreen Terrace, Springfield 49007</w:t>
       </w:r>
     </w:p>
     <w:sectPr>

</xml_diff>